<commit_message>
Relatório: cita relatório SICONFI específico de cada dado
- Adiciona helpers cite_rreo() e cite_rgf() que formatam:
  'RREO – Nº bimestre de YYYY' e 'RGF – Poder Executivo – Nº quadrimestre de YYYY'
- Linhas "Fonte:" em itálico cinza abaixo de cada tabela com origem
  RREO/RGF (KPIs, Investimento, CAPAG, Caixa, Pessoal, PPPs)
- Referências inline nas narrativas: cada número crítico cita o relatório
  + anexo + linha + coluna de onde foi extraído
- Seção "Fontes e Metodologia" no fim atualizada com citações dinâmicas
</commit_message>
<xml_diff>
--- a/docs/relatorio_executivo.docx
+++ b/docs/relatorio_executivo.docx
@@ -37,7 +37,7 @@
           <w:color w:val="6B7280"/>
           <w:sz w:val="20"/>
         </w:rPr>
-        <w:t>Atualização: 11/05/2026</w:t>
+        <w:t>Atualização: 14/05/2026</w:t>
       </w:r>
     </w:p>
     <w:p/>
@@ -60,7 +60,7 @@
           <w:i w:val="0"/>
           <w:sz w:val="22"/>
         </w:rPr>
-        <w:t>O orçamento do Distrito Federal em 2026 é de R$ 44,1 bi (dotação atualizada própria) acrescido de R$ 28,4 bi do Fundo Constitucional (FCDF), totalizando R$ 72,5 bi para fazer frente às despesas do exercício. Apesar do volume de recursos, o DF apresenta um quadro fiscal preocupante.</w:t>
+        <w:t>O orçamento do Distrito Federal em 2026 é de R$ 44,1 bi (dotação atualizada própria, RREO – 1º bimestre de 2026) acrescido de R$ 28,4 bi do Fundo Constitucional (FCDF, dotação atualizada 2026 segundo o Portal da Transparência da União), totalizando R$ 72,5 bi para fazer frente às despesas do exercício. Apesar do volume de recursos, o DF apresenta um quadro fiscal preocupante.</w:t>
       </w:r>
     </w:p>
     <w:p>
@@ -70,7 +70,7 @@
           <w:i w:val="0"/>
           <w:sz w:val="22"/>
         </w:rPr>
-        <w:t>A nota CAPAG consolidada do DF é “C”, classificação que impede a contratação de operações de crédito com garantia da União. O pior indicador é o de Poupança Corrente (95,27% — limite para “B” é 95%), refletindo que praticamente toda a receita corrente é consumida pela despesa corrente, sem margem para investir. A disponibilidade de caixa líquida (após inscrição em Restos a Pagar) caiu de R$ 1,9 bi em 2021 para R$ 570 mi em 2025, com recursos não vinculados negativos em R$ -877 mi.</w:t>
+        <w:t>A nota CAPAG consolidada do DF é “C”, classificação que impede a contratação de operações de crédito com garantia da União. O pior indicador é o de Poupança Corrente (95,27% — limite para “B” é 95%), refletindo que praticamente toda a receita corrente é consumida pela despesa corrente, sem margem para investir. A disponibilidade de caixa líquida (após inscrição em Restos a Pagar) caiu de R$ 1,9 bi em 2021 para R$ 570 mi em 2025 (RGF – Poder Executivo – 3º quadrimestre de 2025, Anexo 05), com recursos não vinculados negativos em R$ -877 mi.</w:t>
       </w:r>
     </w:p>
     <w:p>
@@ -80,7 +80,7 @@
           <w:i w:val="0"/>
           <w:sz w:val="22"/>
         </w:rPr>
-        <w:t>A taxa de investimento sobre a RCL é de 4,7%, posicionando o DF em 20º lugar entre as 27 unidades da federação. Para alcançar a média nacional (8,4%) seriam necessários R$ 1,5 bi/ano adicionais; para o nível do líder (Piauí, 17,0%), R$ 4,8 bi/ano. A despesa com pessoal está em 41,5% da RCL ajustada — dentro do limite legal, mas próxima do alerta (44,1%). Os benefícios tributários totalizam R$ 13,4 bi, equivalente a 57% da receita realizada de impostos.</w:t>
+        <w:t>A taxa de investimento sobre a RCL é de 4,7%, posicionando o DF em 20º lugar entre as 27 unidades da federação. Para alcançar a média nacional (8,4%) seriam necessários R$ 1,5 bi/ano adicionais; para o nível do líder (Piauí, 17,0%), R$ 4,8 bi/ano. A despesa com pessoal está em 41,5% da RCL ajustada (RGF – Poder Executivo – 3º quadrimestre de 2025, Anexo 01) — dentro do limite legal, mas próxima do alerta (44,1%). Os benefícios tributários totalizam R$ 13,4 bi (dado da SEEC-DF), equivalente a 57% da receita realizada de impostos no ano (RREO – 6º bimestre de 2025, Anexo 01).</w:t>
       </w:r>
     </w:p>
     <w:p>
@@ -495,6 +495,16 @@
         </w:tc>
       </w:tr>
     </w:tbl>
+    <w:p>
+      <w:r>
+        <w:rPr>
+          <w:i/>
+          <w:color w:val="6B7280"/>
+          <w:sz w:val="18"/>
+        </w:rPr>
+        <w:t>Fonte: Orçamento DF: RREO – 1º bimestre de 2026, Anexo 01 (Balanço Orçamentário), linha "TOTAL DAS DESPESAS (XII) = (X + XI)", coluna DOTAÇÃO ATUALIZADA. FCDF: Portal da Transparência da União — órgão 25915. Investimento/RCL: cálculo a partir de RREO – 6º bimestre de 2025 (Anexo 01, linha INVESTIMENTOS) e RGF – Poder Executivo – 3º quadrimestre de 2025 (Anexo 01, RCL). CAPAG: Tesouro Transparente. Caixa: RGF – Poder Executivo – 3º quadrimestre de 2025, Anexo 05. Benefícios: Beneficiômetro SEEC-DF.</w:t>
+      </w:r>
+    </w:p>
     <w:p/>
     <w:p>
       <w:pPr>
@@ -516,6 +526,16 @@
           <w:sz w:val="22"/>
         </w:rPr>
         <w:t>A taxa de investimento sobre a RCL do DF (4,7% em 2025) o coloca em 20º lugar no ranking nacional, atrás da média BR (8,4%) e muito distante de estados como Piauí (17%), Espírito Santo (14,8%) e Maranhão (14%). Em termos absolutos, o investimento liquidado evoluiu de R$ 0,7 bi em 2021 para R$ 1,8 bi em 2025.</w:t>
+      </w:r>
+    </w:p>
+    <w:p>
+      <w:r>
+        <w:rPr>
+          <w:i/>
+          <w:color w:val="6B7280"/>
+          <w:sz w:val="18"/>
+        </w:rPr>
+        <w:t>Fonte: Investimento liquidado: RREO – 6º bimestre de 2025, Anexo 01, linha INVESTIMENTOS, coluna DESPESAS LIQUIDADAS ATÉ O BIMESTRE. RCL: RGF – Poder Executivo – 3º quadrimestre de 2025, Anexo 01, linha RECEITA CORRENTE LÍQUIDA (IV). Ranking entre UFs: SICONFI (compilação manual a partir do RREO do exercício).</w:t>
       </w:r>
     </w:p>
     <w:p>
@@ -956,6 +976,16 @@
         </w:tc>
       </w:tr>
     </w:tbl>
+    <w:p>
+      <w:r>
+        <w:rPr>
+          <w:i/>
+          <w:color w:val="6B7280"/>
+          <w:sz w:val="18"/>
+        </w:rPr>
+        <w:t>Fonte: Tesouro Nacional / Tesouro Transparente — CAPAG dos Estados (publicação anual).</w:t>
+      </w:r>
+    </w:p>
     <w:p/>
     <w:p>
       <w:r>
@@ -2073,6 +2103,16 @@
         </w:tc>
       </w:tr>
     </w:tbl>
+    <w:p>
+      <w:r>
+        <w:rPr>
+          <w:i/>
+          <w:color w:val="6B7280"/>
+          <w:sz w:val="18"/>
+        </w:rPr>
+        <w:t>Fonte: Tesouro Nacional / Tesouro Transparente — CAPAG dos Estados (publicações anuais 2018–2025).</w:t>
+      </w:r>
+    </w:p>
     <w:p/>
     <w:p>
       <w:r>
@@ -2534,6 +2574,16 @@
         </w:tc>
       </w:tr>
     </w:tbl>
+    <w:p>
+      <w:r>
+        <w:rPr>
+          <w:i/>
+          <w:color w:val="6B7280"/>
+          <w:sz w:val="18"/>
+        </w:rPr>
+        <w:t>Fonte: RGF – Poder Executivo – 3º quadrimestre de cada exercício (2021 a 2025), Anexo 05 — Demonstrativo da Disponibilidade de Caixa e dos Restos a Pagar. Linha TOTAL (“IV = I+II+III” desde 2023, “III = I+II” em 2021-22) e linha TOTAL DOS RECURSOS NÃO VINCULADOS (I), coluna DISPONIBILIDADE DE CAIXA LÍQUIDA (APÓS A INSCRIÇÃO EM RESTOS A PAGAR NÃO PROCESSADOS DO EXERCÍCIO).</w:t>
+      </w:r>
+    </w:p>
     <w:p/>
     <w:p>
       <w:r>
@@ -2936,6 +2986,16 @@
         </w:tc>
       </w:tr>
     </w:tbl>
+    <w:p>
+      <w:r>
+        <w:rPr>
+          <w:i/>
+          <w:color w:val="6B7280"/>
+          <w:sz w:val="18"/>
+        </w:rPr>
+        <w:t>Fonte: RGF – Poder Executivo – 3º quadrimestre de 2025, Anexo 01 — Demonstrativo da Despesa com Pessoal. Linha DESPESA TOTAL COM PESSOAL – DTP (VI), coluna % SOBRE A RCL AJUSTADA.</w:t>
+      </w:r>
+    </w:p>
     <w:p/>
     <w:p>
       <w:r>
@@ -2968,7 +3028,7 @@
           <w:i w:val="0"/>
           <w:sz w:val="22"/>
         </w:rPr>
-        <w:t>O valor total de benefícios tributários concedidos pelo DF em 2025 foi de R$ 13,4 bi, o que equivale a 57% da receita realizada de impostos no exercício (R$ 23,4 bi). É um volume expressivo, com implicações fiscais diretas: cada ponto percentual a menos de benefício pode liberar centenas de milhões de reais para outras finalidades (caixa, investimento, pessoal).</w:t>
+        <w:t>O valor total de benefícios tributários concedidos pelo DF em 2025 foi de R$ 13,4 bi (Beneficiômetro SEEC-DF), o que equivale a 57% da receita realizada de impostos no exercício (R$ 23,4 bi — RREO – 6º bimestre de 2025, Anexo 01, linha Impostos, coluna RECEITAS REALIZADAS ATÉ O BIMESTRE). É um volume expressivo, com implicações fiscais diretas: cada ponto percentual a menos de benefício pode liberar centenas de milhões de reais para outras finalidades (caixa, investimento, pessoal).</w:t>
       </w:r>
     </w:p>
     <w:p>
@@ -3624,6 +3684,16 @@
         </w:tc>
       </w:tr>
     </w:tbl>
+    <w:p>
+      <w:r>
+        <w:rPr>
+          <w:i/>
+          <w:color w:val="6B7280"/>
+          <w:sz w:val="18"/>
+        </w:rPr>
+        <w:t>Fonte: Lista de projetos e projeção de comprometimento: Demonstrativo das Parcerias Público-Privadas do RREO – 6º bimestre de 2025, Anexo 13.</w:t>
+      </w:r>
+    </w:p>
     <w:p/>
     <w:p>
       <w:pPr>
@@ -3858,7 +3928,7 @@
         <w:rPr>
           <w:sz w:val="22"/>
         </w:rPr>
-        <w:t>SICONFI/STN — RREO 2026/1 (atual) e 2025/6 (fechamento), RGF 2025/3</w:t>
+        <w:t>SICONFI/STN — RREO – 1º bimestre de 2026 (orçamento DF 2026)</w:t>
       </w:r>
     </w:p>
     <w:p>
@@ -3869,7 +3939,7 @@
         <w:rPr>
           <w:sz w:val="22"/>
         </w:rPr>
-        <w:t>Tesouro Transparente — CAPAG (CSV anual)</w:t>
+        <w:t>SICONFI/STN — RREO – 6º bimestre de 2025 (investimento liquidado, receita de impostos, PPPs)</w:t>
       </w:r>
     </w:p>
     <w:p>
@@ -3880,7 +3950,40 @@
         <w:rPr>
           <w:sz w:val="22"/>
         </w:rPr>
-        <w:t>IBGE — população do DF (estimativa)</w:t>
+        <w:t>SICONFI/STN — RGF – Poder Executivo – 3º quadrimestre de 2025 (RCL, DTP e disponibilidade de caixa)</w:t>
+      </w:r>
+    </w:p>
+    <w:p>
+      <w:pPr>
+        <w:pStyle w:val="ListBullet"/>
+      </w:pPr>
+      <w:r>
+        <w:rPr>
+          <w:sz w:val="22"/>
+        </w:rPr>
+        <w:t>SICONFI/STN — RGF – Poder Executivo – 3º quadrimestre dos exercícios 2021 a 2024 (histórico de caixa)</w:t>
+      </w:r>
+    </w:p>
+    <w:p>
+      <w:pPr>
+        <w:pStyle w:val="ListBullet"/>
+      </w:pPr>
+      <w:r>
+        <w:rPr>
+          <w:sz w:val="22"/>
+        </w:rPr>
+        <w:t>Tesouro Transparente — CAPAG dos Estados (publicações anuais 2018–2025)</w:t>
+      </w:r>
+    </w:p>
+    <w:p>
+      <w:pPr>
+        <w:pStyle w:val="ListBullet"/>
+      </w:pPr>
+      <w:r>
+        <w:rPr>
+          <w:sz w:val="22"/>
+        </w:rPr>
+        <w:t>IBGE — população residente estimada (SIDRA, agregado 6579)</w:t>
       </w:r>
     </w:p>
     <w:p>
@@ -3903,17 +4006,6 @@
           <w:sz w:val="22"/>
         </w:rPr>
         <w:t>Beneficiômetro SEEC-DF — valor total dos benefícios tributários</w:t>
-      </w:r>
-    </w:p>
-    <w:p>
-      <w:pPr>
-        <w:pStyle w:val="ListBullet"/>
-      </w:pPr>
-      <w:r>
-        <w:rPr>
-          <w:sz w:val="22"/>
-        </w:rPr>
-        <w:t>RREO do DF — informações sobre PPPs e projeções</w:t>
       </w:r>
     </w:p>
     <w:p>

</xml_diff>